<commit_message>
Stabilize DOCX handbook generation
</commit_message>
<xml_diff>
--- a/assets/company-template.docx
+++ b/assets/company-template.docx
@@ -28,10 +28,10 @@
           <w:lang w:val="en-US" w:eastAsia="zh-CN"/>
         </w:rPr>
       </w:pPr>
+      <w:bookmarkStart w:id="12" w:name="_GoBack"/>
+      <w:bookmarkEnd w:id="12"/>
       <w:bookmarkStart w:id="0" w:name="_Toc1620138519"/>
       <w:bookmarkStart w:id="1" w:name="_Toc30255683"/>
-      <w:bookmarkStart w:id="12" w:name="_GoBack"/>
-      <w:bookmarkEnd w:id="12"/>
       <w:r>
         <w:rPr>
           <w:rFonts w:hint="eastAsia" w:ascii="Source Han Sans SC Regular" w:hAnsi="Source Han Sans SC Regular" w:eastAsia="Source Han Sans SC Regular" w:cs="Source Han Sans SC Regular"/>
@@ -1845,7 +1845,7 @@
       <mc:AlternateContent>
         <mc:Choice Requires="wps">
           <w:drawing>
-            <wp:anchor distT="0" distB="0" distL="114300" distR="114300" simplePos="0" relativeHeight="251663360" behindDoc="0" locked="0" layoutInCell="1" allowOverlap="1">
+            <wp:anchor distT="0" distB="0" distL="114300" distR="114300" simplePos="0" relativeHeight="251662336" behindDoc="0" locked="0" layoutInCell="1" allowOverlap="1">
               <wp:simplePos x="0" y="0"/>
               <wp:positionH relativeFrom="margin">
                 <wp:align>right</wp:align>
@@ -1924,7 +1924,7 @@
         </mc:Choice>
         <mc:Fallback>
           <w:pict>
-            <v:shape id="_x0000_s1026" o:spid="_x0000_s1026" o:spt="202" type="#_x0000_t202" style="position:absolute;left:0pt;margin-top:0pt;height:144pt;width:144pt;mso-position-horizontal:right;mso-position-horizontal-relative:margin;mso-wrap-style:none;z-index:251663360;mso-width-relative:page;mso-height-relative:page;" filled="f" stroked="f" coordsize="21600,21600" o:gfxdata="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">
+            <v:shape id="_x0000_s1026" o:spid="_x0000_s1026" o:spt="202" type="#_x0000_t202" style="position:absolute;left:0pt;margin-top:0pt;height:144pt;width:144pt;mso-position-horizontal:right;mso-position-horizontal-relative:margin;mso-wrap-style:none;z-index:251662336;mso-width-relative:page;mso-height-relative:page;" filled="f" stroked="f" coordsize="21600,21600" o:gfxdata="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">
               <v:fill on="f" focussize="0,0"/>
               <v:stroke on="f" weight="0.5pt"/>
               <v:imagedata o:title=""/>
@@ -2052,7 +2052,7 @@
         <w:rFonts w:hint="eastAsia"/>
         <w:lang w:val="en-US" w:eastAsia="zh-CN"/>
       </w:rPr>
-      <w:t>织灵产品手册</w:t>
+      <w:t>文档名称</w:t>
     </w:r>
   </w:p>
 </w:hdr>
@@ -2085,25 +2085,41 @@
   <w:p>
     <w:pPr>
       <w:pStyle w:val="15"/>
+      <w:jc w:val="both"/>
+      <w:rPr>
+        <w:color w:val="FFFFFF" w:themeColor="background1"/>
+        <w14:textFill>
+          <w14:solidFill>
+            <w14:schemeClr w14:val="bg1"/>
+          </w14:solidFill>
+        </w14:textFill>
+      </w:rPr>
     </w:pPr>
     <w:r>
       <w:rPr>
-        <w:rFonts w:hint="eastAsia" w:ascii="Arial" w:hAnsi="Arial" w:cs="Arial"/>
+        <w:rFonts w:hint="default" w:ascii="Source Han Sans SC" w:hAnsi="Source Han Sans SC" w:eastAsia="Source Han Sans SC" w:cs="Source Han Sans SC"/>
+        <w:color w:val="FFFFFF" w:themeColor="background1"/>
         <w:sz w:val="24"/>
+        <w:lang w:val="en-US"/>
+        <w14:textFill>
+          <w14:solidFill>
+            <w14:schemeClr w14:val="bg1"/>
+          </w14:solidFill>
+        </w14:textFill>
       </w:rPr>
       <w:drawing>
-        <wp:anchor distT="0" distB="0" distL="114300" distR="114300" simplePos="0" relativeHeight="251661312" behindDoc="1" locked="0" layoutInCell="1" allowOverlap="1">
+        <wp:anchor distT="0" distB="0" distL="114300" distR="114300" simplePos="0" relativeHeight="251663360" behindDoc="1" locked="0" layoutInCell="1" allowOverlap="1">
           <wp:simplePos x="0" y="0"/>
           <wp:positionH relativeFrom="column">
-            <wp:posOffset>4479290</wp:posOffset>
+            <wp:posOffset>4493260</wp:posOffset>
           </wp:positionH>
           <wp:positionV relativeFrom="paragraph">
-            <wp:posOffset>-123825</wp:posOffset>
+            <wp:posOffset>50800</wp:posOffset>
           </wp:positionV>
           <wp:extent cx="765175" cy="209550"/>
           <wp:effectExtent l="0" t="0" r="22225" b="19050"/>
           <wp:wrapNone/>
-          <wp:docPr id="11" name="图片 11" descr="img_v3_02vg_90bf1475-2726-497b-841e-26644715200g"/>
+          <wp:docPr id="2" name="图片 2" descr="img_v3_02vg_90bf1475-2726-497b-841e-26644715200g"/>
           <wp:cNvGraphicFramePr>
             <a:graphicFrameLocks xmlns:a="http://schemas.openxmlformats.org/drawingml/2006/main" noChangeAspect="1"/>
           </wp:cNvGraphicFramePr>
@@ -2111,7 +2127,7 @@
             <a:graphicData uri="http://schemas.openxmlformats.org/drawingml/2006/picture">
               <pic:pic xmlns:pic="http://schemas.openxmlformats.org/drawingml/2006/picture">
                 <pic:nvPicPr>
-                  <pic:cNvPr id="11" name="图片 11" descr="img_v3_02vg_90bf1475-2726-497b-841e-26644715200g"/>
+                  <pic:cNvPr id="2" name="图片 2" descr="img_v3_02vg_90bf1475-2726-497b-841e-26644715200g"/>
                   <pic:cNvPicPr>
                     <a:picLocks noChangeAspect="1"/>
                   </pic:cNvPicPr>
@@ -2137,6 +2153,20 @@
         </wp:anchor>
       </w:drawing>
     </w:r>
+    <w:r>
+      <w:rPr>
+        <w:rFonts w:hint="eastAsia" w:ascii="Source Han Sans SC" w:hAnsi="Source Han Sans SC" w:eastAsia="Source Han Sans SC" w:cs="Source Han Sans SC"/>
+        <w:color w:val="FFFFFF" w:themeColor="background1"/>
+        <w:sz w:val="24"/>
+        <w:lang w:val="en-US" w:eastAsia="zh-CN"/>
+        <w14:textFill>
+          <w14:solidFill>
+            <w14:schemeClr w14:val="bg1"/>
+          </w14:solidFill>
+        </w14:textFill>
+      </w:rPr>
+      <w:t>织灵产品手册</w:t>
+    </w:r>
   </w:p>
 </w:hdr>
 </file>
@@ -2160,13 +2190,13 @@
         <w:lang w:val="en-US"/>
       </w:rPr>
       <w:drawing>
-        <wp:anchor distT="0" distB="0" distL="114300" distR="114300" simplePos="0" relativeHeight="251662336" behindDoc="1" locked="0" layoutInCell="1" allowOverlap="1">
+        <wp:anchor distT="0" distB="0" distL="114300" distR="114300" simplePos="0" relativeHeight="251661312" behindDoc="1" locked="0" layoutInCell="1" allowOverlap="1">
           <wp:simplePos x="0" y="0"/>
           <wp:positionH relativeFrom="column">
-            <wp:posOffset>4479290</wp:posOffset>
+            <wp:posOffset>4493260</wp:posOffset>
           </wp:positionH>
           <wp:positionV relativeFrom="paragraph">
-            <wp:posOffset>-76200</wp:posOffset>
+            <wp:posOffset>50800</wp:posOffset>
           </wp:positionV>
           <wp:extent cx="765175" cy="209550"/>
           <wp:effectExtent l="0" t="0" r="22225" b="19050"/>

</xml_diff>